<commit_message>
FSM milestone: added goal detection, wall-following, explore stability, and loop prevention (known issue: occasional re-entry and escape behavior still present)
</commit_message>
<xml_diff>
--- a/report/3003ICT OL4 Pitch Document.docx
+++ b/report/3003ICT OL4 Pitch Document.docx
@@ -6,7 +6,7 @@
     <w:sdt>
       <w:sdtPr>
         <w:rPr>
-          <w:rFonts w:ascii="Arial" w:hAnsi="Arial"/>
+          <w:rFonts w:ascii="Arial" w:eastAsiaTheme="minorHAnsi" w:hAnsi="Arial"/>
           <w:color w:val="156082" w:themeColor="accent1"/>
           <w:sz w:val="24"/>
           <w:szCs w:val="24"/>
@@ -397,7 +397,23 @@
             <w:t>Group members:</w:t>
           </w:r>
           <w:r>
-            <w:t>Jenjira Kongpong</w:t>
+            <w:rPr>
+              <w:rFonts w:asciiTheme="minorHAnsi" w:hAnsiTheme="minorHAnsi" w:cs="Times New Roman"/>
+              <w:b/>
+              <w:bCs/>
+              <w:sz w:val="28"/>
+              <w:szCs w:val="28"/>
+              <w:lang w:val="en-AU"/>
+            </w:rPr>
+            <w:t xml:space="preserve"> </w:t>
+          </w:r>
+          <w:proofErr w:type="spellStart"/>
+          <w:r>
+            <w:t>Jenjira</w:t>
+          </w:r>
+          <w:proofErr w:type="spellEnd"/>
+          <w:r>
+            <w:t xml:space="preserve"> Kongpong</w:t>
           </w:r>
           <w:r>
             <w:t>,</w:t>
@@ -409,10 +425,21 @@
             <w:rPr>
               <w:color w:val="000000" w:themeColor="text1"/>
             </w:rPr>
-            <w:t>s5393441</w:t>
+            <w:t>S</w:t>
+          </w:r>
+          <w:r>
+            <w:rPr>
+              <w:color w:val="000000" w:themeColor="text1"/>
+            </w:rPr>
+            <w:t>5393441</w:t>
           </w:r>
         </w:p>
         <w:p>
+          <w:pPr>
+            <w:rPr>
+              <w:caps/>
+            </w:rPr>
+          </w:pPr>
           <w:r>
             <w:tab/>
           </w:r>
@@ -421,6 +448,9 @@
           </w:r>
           <w:r>
             <w:tab/>
+          </w:r>
+          <w:r>
+            <w:t xml:space="preserve"> </w:t>
           </w:r>
           <w:proofErr w:type="spellStart"/>
           <w:r>
@@ -439,7 +469,10 @@
             <w:t xml:space="preserve">, </w:t>
           </w:r>
           <w:r>
-            <w:t>s5251658</w:t>
+            <w:t>S</w:t>
+          </w:r>
+          <w:r>
+            <w:t>5251658</w:t>
           </w:r>
         </w:p>
         <w:p>
@@ -456,6 +489,9 @@
           </w:r>
           <w:r>
             <w:tab/>
+          </w:r>
+          <w:r>
+            <w:t xml:space="preserve"> </w:t>
           </w:r>
           <w:r>
             <w:rPr>
@@ -818,24 +854,15 @@
         </w:rPr>
       </w:pPr>
       <w:r>
-        <w:rPr>
-          <w:lang w:val="en-AU"/>
-        </w:rPr>
         <w:t xml:space="preserve">The goal of this project is to develop an autonomous robot in </w:t>
       </w:r>
       <w:proofErr w:type="spellStart"/>
       <w:r>
-        <w:rPr>
-          <w:lang w:val="en-AU"/>
-        </w:rPr>
         <w:t>Webots</w:t>
       </w:r>
       <w:proofErr w:type="spellEnd"/>
       <w:r>
-        <w:rPr>
-          <w:lang w:val="en-AU"/>
-        </w:rPr>
-        <w:t xml:space="preserve"> that navigates a maze using sensor-based decision making (Michel, 2004). The robot will operate independently, detect obstacles, and attempt to reach the exit without human intervention.</w:t>
+        <w:t xml:space="preserve"> that navigates a maze using sensor-based decision making (Michel, 2004). The robot will operate independently, detect obstacles, and navigate toward the maze exit.</w:t>
       </w:r>
     </w:p>
     <w:p>
@@ -862,18 +889,7 @@
         </w:rPr>
       </w:pPr>
       <w:r>
-        <w:rPr>
-          <w:b/>
-          <w:bCs/>
-          <w:lang w:val="en-AU"/>
-        </w:rPr>
-        <w:t>Purpose:</w:t>
-      </w:r>
-      <w:r>
-        <w:rPr>
-          <w:lang w:val="en-AU"/>
-        </w:rPr>
-        <w:t xml:space="preserve"> autonomously navigate a maze and reach an exit while avoiding obstacles.</w:t>
+        <w:t>Purpose: autonomously navigate a maze and reach an exit while avoiding obstacles.</w:t>
       </w:r>
     </w:p>
     <w:p>
@@ -887,18 +903,7 @@
         </w:rPr>
       </w:pPr>
       <w:r>
-        <w:rPr>
-          <w:b/>
-          <w:bCs/>
-          <w:lang w:val="en-AU"/>
-        </w:rPr>
-        <w:t>Sensors:</w:t>
-      </w:r>
-      <w:r>
-        <w:rPr>
-          <w:lang w:val="en-AU"/>
-        </w:rPr>
-        <w:t xml:space="preserve"> distance sensors (front, left, right), camera for goal detection, and wheel encoders for tracking movement.</w:t>
+        <w:t>Sensors: distance sensors (front, left, right) and wheel encoders for tracking movement.</w:t>
       </w:r>
     </w:p>
     <w:p>
@@ -912,18 +917,7 @@
         </w:rPr>
       </w:pPr>
       <w:r>
-        <w:rPr>
-          <w:b/>
-          <w:bCs/>
-          <w:lang w:val="en-AU"/>
-        </w:rPr>
-        <w:t>Actuators:</w:t>
-      </w:r>
-      <w:r>
-        <w:rPr>
-          <w:lang w:val="en-AU"/>
-        </w:rPr>
-        <w:t xml:space="preserve"> wheel motors with differential drive, optional LEDs, and a buzzer.</w:t>
+        <w:t>Actuators: wheel motors with differential drive.</w:t>
       </w:r>
     </w:p>
     <w:p>
@@ -937,43 +931,57 @@
         </w:rPr>
       </w:pPr>
       <w:r>
-        <w:rPr>
-          <w:b/>
-          <w:bCs/>
-          <w:lang w:val="en-AU"/>
-        </w:rPr>
-        <w:t>Intelligent behaviour:</w:t>
-      </w:r>
-      <w:r>
-        <w:rPr>
-          <w:lang w:val="en-AU"/>
-        </w:rPr>
-        <w:t xml:space="preserve"> a Finite State Machine (FSM) managing states such as Idle, Explore Maze, Wall Follow, Turn Decision, Goal Reached, and Emergency Stop (Arkin, 1998).</w:t>
-      </w:r>
-    </w:p>
-    <w:p>
-      <w:pPr>
-        <w:rPr>
-          <w:lang w:val="en-AU"/>
-        </w:rPr>
-      </w:pPr>
-      <w:r>
-        <w:rPr>
-          <w:lang w:val="en-AU"/>
+        <w:t>Intelligent behaviour: a Finite State Machine (FSM) managing states such as Explore, Wall Follow, obstacle avoidance, and goal-handling behaviours (Arkin, 1998).</w:t>
+      </w:r>
+    </w:p>
+    <w:p>
+      <w:pPr>
+        <w:pStyle w:val="Heading1"/>
+        <w:rPr>
+          <w:rFonts w:ascii="Arial" w:eastAsiaTheme="minorHAnsi" w:hAnsi="Arial" w:cstheme="minorBidi"/>
+          <w:b w:val="0"/>
+          <w:kern w:val="0"/>
+          <w:sz w:val="22"/>
+          <w:szCs w:val="22"/>
+          <w:lang w:eastAsia="en-US"/>
+          <w14:ligatures w14:val="none"/>
+        </w:rPr>
+      </w:pPr>
+      <w:r>
+        <w:rPr>
+          <w:rFonts w:ascii="Arial" w:eastAsiaTheme="minorHAnsi" w:hAnsi="Arial" w:cstheme="minorBidi"/>
+          <w:b w:val="0"/>
+          <w:kern w:val="0"/>
+          <w:sz w:val="22"/>
+          <w:szCs w:val="22"/>
+          <w:lang w:eastAsia="en-US"/>
+          <w14:ligatures w14:val="none"/>
         </w:rPr>
         <w:t xml:space="preserve">The robot will operate in a maze of corridors and turns, requiring continuous navigation decisions. Core capabilities include wall detection, path selection, obstacle avoidance, and goal reaching (Siegwart, Nourbakhsh, &amp; </w:t>
       </w:r>
       <w:proofErr w:type="spellStart"/>
       <w:r>
         <w:rPr>
-          <w:lang w:val="en-AU"/>
+          <w:rFonts w:ascii="Arial" w:eastAsiaTheme="minorHAnsi" w:hAnsi="Arial" w:cstheme="minorBidi"/>
+          <w:b w:val="0"/>
+          <w:kern w:val="0"/>
+          <w:sz w:val="22"/>
+          <w:szCs w:val="22"/>
+          <w:lang w:eastAsia="en-US"/>
+          <w14:ligatures w14:val="none"/>
         </w:rPr>
         <w:t>Scaramuzza</w:t>
       </w:r>
       <w:proofErr w:type="spellEnd"/>
       <w:r>
         <w:rPr>
-          <w:lang w:val="en-AU"/>
+          <w:rFonts w:ascii="Arial" w:eastAsiaTheme="minorHAnsi" w:hAnsi="Arial" w:cstheme="minorBidi"/>
+          <w:b w:val="0"/>
+          <w:kern w:val="0"/>
+          <w:sz w:val="22"/>
+          <w:szCs w:val="22"/>
+          <w:lang w:eastAsia="en-US"/>
+          <w14:ligatures w14:val="none"/>
         </w:rPr>
         <w:t>, 2011).</w:t>
       </w:r>
@@ -1091,7 +1099,13 @@
         <w:rPr>
           <w:lang w:val="en-AU" w:eastAsia="zh-CN"/>
         </w:rPr>
-        <w:t xml:space="preserve"> Camera or sensors will detect goal markers and transition FSM to “Goal Reached.”</w:t>
+        <w:t xml:space="preserve"> </w:t>
+      </w:r>
+      <w:r>
+        <w:rPr>
+          <w:lang w:eastAsia="zh-CN"/>
+        </w:rPr>
+        <w:t>The robot uses position-based information from the simulator (translation field) to compute the distance to the predefined goal location. When the distance falls below a defined threshold, the FSM transitions to the “Goal Reached” state.</w:t>
       </w:r>
     </w:p>
     <w:p>
@@ -1117,7 +1131,37 @@
         <w:rPr>
           <w:lang w:val="en-AU" w:eastAsia="zh-CN"/>
         </w:rPr>
-        <w:t xml:space="preserve"> Emergency stop, LEDs, buzzer, and fail-safes handle unexpected situations.</w:t>
+        <w:t xml:space="preserve"> Emergency stop</w:t>
+      </w:r>
+      <w:r>
+        <w:rPr>
+          <w:lang w:val="en-AU" w:eastAsia="zh-CN"/>
+        </w:rPr>
+        <w:t xml:space="preserve"> </w:t>
+      </w:r>
+      <w:r>
+        <w:rPr>
+          <w:lang w:val="en-AU" w:eastAsia="zh-CN"/>
+        </w:rPr>
+        <w:t>and fail-</w:t>
+      </w:r>
+      <w:r>
+        <w:rPr>
+          <w:lang w:val="en-AU" w:eastAsia="zh-CN"/>
+        </w:rPr>
+        <w:t xml:space="preserve">safe </w:t>
+      </w:r>
+      <w:r>
+        <w:rPr>
+          <w:lang w:eastAsia="zh-CN"/>
+        </w:rPr>
+        <w:t>mechanisms</w:t>
+      </w:r>
+      <w:r>
+        <w:rPr>
+          <w:lang w:val="en-AU" w:eastAsia="zh-CN"/>
+        </w:rPr>
+        <w:t xml:space="preserve"> handle unexpected situations.</w:t>
       </w:r>
     </w:p>
     <w:p>
@@ -1143,7 +1187,19 @@
         <w:rPr>
           <w:lang w:val="en-AU" w:eastAsia="zh-CN"/>
         </w:rPr>
-        <w:t xml:space="preserve"> Multi-condition logic combines distance sensors, camera, and wheel encoders for reliable navigation.</w:t>
+        <w:t xml:space="preserve"> Multi-condition logic </w:t>
+      </w:r>
+      <w:r>
+        <w:rPr>
+          <w:lang w:val="en-AU" w:eastAsia="zh-CN"/>
+        </w:rPr>
+        <w:t>integrates</w:t>
+      </w:r>
+      <w:r>
+        <w:rPr>
+          <w:lang w:val="en-AU" w:eastAsia="zh-CN"/>
+        </w:rPr>
+        <w:t xml:space="preserve"> distance sensors and wheel encoders for reliable navigation.</w:t>
       </w:r>
     </w:p>
     <w:p>
@@ -1258,7 +1314,19 @@
         <w:rPr>
           <w:lang w:val="en-AU" w:eastAsia="zh-CN"/>
         </w:rPr>
-        <w:t xml:space="preserve"> Distance sensors, wheel encoders, and camera provide environmental data.</w:t>
+        <w:t xml:space="preserve"> Distance sensors</w:t>
+      </w:r>
+      <w:r>
+        <w:rPr>
+          <w:lang w:val="en-AU" w:eastAsia="zh-CN"/>
+        </w:rPr>
+        <w:t xml:space="preserve"> and </w:t>
+      </w:r>
+      <w:r>
+        <w:rPr>
+          <w:lang w:val="en-AU" w:eastAsia="zh-CN"/>
+        </w:rPr>
+        <w:t>wheel encoders provide environmental data.</w:t>
       </w:r>
     </w:p>
     <w:p>
@@ -1308,7 +1376,19 @@
         <w:rPr>
           <w:lang w:val="en-AU" w:eastAsia="zh-CN"/>
         </w:rPr>
-        <w:t xml:space="preserve"> FSM selects the next action based on current state and sensor inputs.</w:t>
+        <w:t xml:space="preserve"> </w:t>
+      </w:r>
+      <w:r>
+        <w:rPr>
+          <w:lang w:val="en-AU" w:eastAsia="zh-CN"/>
+        </w:rPr>
+        <w:t xml:space="preserve">The </w:t>
+      </w:r>
+      <w:r>
+        <w:rPr>
+          <w:lang w:val="en-AU" w:eastAsia="zh-CN"/>
+        </w:rPr>
+        <w:t>FSM selects the next action based on current state and sensor inputs.</w:t>
       </w:r>
     </w:p>
     <w:p>
@@ -1333,7 +1413,13 @@
         <w:rPr>
           <w:lang w:val="en-AU" w:eastAsia="zh-CN"/>
         </w:rPr>
-        <w:t xml:space="preserve"> Wheel motors execute movement; LEDs or buzzer provide feedback.</w:t>
+        <w:t xml:space="preserve"> </w:t>
+      </w:r>
+      <w:r>
+        <w:rPr>
+          <w:lang w:eastAsia="zh-CN"/>
+        </w:rPr>
+        <w:t>Wheel motors execute movement commands.</w:t>
       </w:r>
     </w:p>
     <w:p>
@@ -1381,7 +1467,25 @@
         <w:t>Finite State Machine (FSM)</w:t>
       </w:r>
       <w:r>
-        <w:t xml:space="preserve"> with states: Idle, Explore Maze, Wall Follow, Turn Decision, Goal Reached, and Emergency Stop (Arkin, 1998; Siegwart et al., 2011). State transitions will be triggered by sensor inputs, allowing reactive decisions without requiring a global map</w:t>
+        <w:t xml:space="preserve"> with states</w:t>
+      </w:r>
+      <w:r>
+        <w:t xml:space="preserve"> such as</w:t>
+      </w:r>
+      <w:r>
+        <w:t xml:space="preserve"> Idle, Explore Maze, Wall Follow, </w:t>
+      </w:r>
+      <w:r>
+        <w:t>and go</w:t>
+      </w:r>
+      <w:r>
+        <w:t>al</w:t>
+      </w:r>
+      <w:r>
+        <w:t>-handling behaviours</w:t>
+      </w:r>
+      <w:r>
+        <w:t xml:space="preserve"> (Arkin, 1998; Siegwart et al., 2011). State transitions will be triggered by sensor inputs, allowing reactive decisions without requiring a global map</w:t>
       </w:r>
       <w:r>
         <w:rPr>
@@ -1389,6 +1493,15 @@
         </w:rPr>
         <w:t>.</w:t>
       </w:r>
+      <w:r>
+        <w:rPr>
+          <w:lang w:val="en-AU"/>
+        </w:rPr>
+        <w:t xml:space="preserve"> </w:t>
+      </w:r>
+      <w:r>
+        <w:t>These states may be refined during implementation based on testing and performance.</w:t>
+      </w:r>
     </w:p>
     <w:p>
       <w:pPr>
@@ -1407,162 +1520,14 @@
     <w:p>
       <w:pPr>
         <w:rPr>
-          <w:lang w:val="en-AU" w:eastAsia="zh-CN"/>
-        </w:rPr>
-      </w:pPr>
-      <w:r>
-        <w:rPr>
-          <w:lang w:val="en-AU" w:eastAsia="zh-CN"/>
+          <w:lang w:eastAsia="zh-CN"/>
+        </w:rPr>
+      </w:pPr>
+      <w:r>
+        <w:rPr>
+          <w:lang w:eastAsia="zh-CN"/>
         </w:rPr>
         <w:t>Sensor data will be continuously read and processed:</w:t>
-      </w:r>
-    </w:p>
-    <w:p>
-      <w:pPr>
-        <w:numPr>
-          <w:ilvl w:val="0"/>
-          <w:numId w:val="7"/>
-        </w:numPr>
-        <w:rPr>
-          <w:lang w:val="en-AU" w:eastAsia="zh-CN"/>
-        </w:rPr>
-      </w:pPr>
-      <w:r>
-        <w:rPr>
-          <w:b/>
-          <w:bCs/>
-          <w:lang w:val="en-AU" w:eastAsia="zh-CN"/>
-        </w:rPr>
-        <w:t>Distance sensors:</w:t>
-      </w:r>
-      <w:r>
-        <w:rPr>
-          <w:lang w:val="en-AU" w:eastAsia="zh-CN"/>
-        </w:rPr>
-        <w:t xml:space="preserve"> detect walls and obstacles for navigation and collision avoidance.</w:t>
-      </w:r>
-    </w:p>
-    <w:p>
-      <w:pPr>
-        <w:numPr>
-          <w:ilvl w:val="0"/>
-          <w:numId w:val="7"/>
-        </w:numPr>
-        <w:rPr>
-          <w:lang w:val="en-AU" w:eastAsia="zh-CN"/>
-        </w:rPr>
-      </w:pPr>
-      <w:r>
-        <w:rPr>
-          <w:b/>
-          <w:bCs/>
-          <w:lang w:val="en-AU" w:eastAsia="zh-CN"/>
-        </w:rPr>
-        <w:t>Camera:</w:t>
-      </w:r>
-      <w:r>
-        <w:rPr>
-          <w:lang w:val="en-AU" w:eastAsia="zh-CN"/>
-        </w:rPr>
-        <w:t xml:space="preserve"> may detect goal markers.</w:t>
-      </w:r>
-    </w:p>
-    <w:p>
-      <w:pPr>
-        <w:numPr>
-          <w:ilvl w:val="0"/>
-          <w:numId w:val="7"/>
-        </w:numPr>
-        <w:rPr>
-          <w:lang w:val="en-AU" w:eastAsia="zh-CN"/>
-        </w:rPr>
-      </w:pPr>
-      <w:r>
-        <w:rPr>
-          <w:b/>
-          <w:bCs/>
-          <w:lang w:val="en-AU" w:eastAsia="zh-CN"/>
-        </w:rPr>
-        <w:t>Wheel encoders:</w:t>
-      </w:r>
-      <w:r>
-        <w:rPr>
-          <w:lang w:val="en-AU" w:eastAsia="zh-CN"/>
-        </w:rPr>
-        <w:t xml:space="preserve"> track movement distance for navigation accuracy.</w:t>
-      </w:r>
-    </w:p>
-    <w:p>
-      <w:pPr>
-        <w:rPr>
-          <w:lang w:val="en-AU" w:eastAsia="zh-CN"/>
-        </w:rPr>
-      </w:pPr>
-      <w:r>
-        <w:rPr>
-          <w:lang w:val="en-AU" w:eastAsia="zh-CN"/>
-        </w:rPr>
-        <w:t>Sensor fusion and multi-condition logic will allow accurate, reliable decisions, supporting safe maze navigation (Corke, 2011)</w:t>
-      </w:r>
-      <w:r>
-        <w:rPr>
-          <w:lang w:val="en-AU" w:eastAsia="zh-CN"/>
-        </w:rPr>
-        <w:t>.</w:t>
-      </w:r>
-    </w:p>
-    <w:p>
-      <w:pPr>
-        <w:pStyle w:val="Heading1"/>
-        <w:rPr>
-          <w:lang w:val="en-AU"/>
-        </w:rPr>
-      </w:pPr>
-      <w:r>
-        <w:rPr>
-          <w:lang w:val="en-AU"/>
-        </w:rPr>
-        <w:t>6. Safety and Robustness</w:t>
-      </w:r>
-    </w:p>
-    <w:p>
-      <w:pPr>
-        <w:rPr>
-          <w:lang w:val="en-AU" w:eastAsia="zh-CN"/>
-        </w:rPr>
-      </w:pPr>
-      <w:r>
-        <w:rPr>
-          <w:lang w:val="en-AU" w:eastAsia="zh-CN"/>
-        </w:rPr>
-        <w:t>Emergency stops will prevent collisions. LEDs and a buzzer will indicate robot state or errors. Fail-safe behaviours will allow the robot to respond to blocked paths or unexpected conditions. Timeout mechanisms will prevent the robot from becoming stuck indefinitely.</w:t>
-      </w:r>
-    </w:p>
-    <w:p>
-      <w:pPr>
-        <w:pStyle w:val="Heading1"/>
-        <w:rPr>
-          <w:lang w:val="en-AU"/>
-        </w:rPr>
-      </w:pPr>
-      <w:r>
-        <w:rPr>
-          <w:lang w:val="en-AU"/>
-        </w:rPr>
-        <w:t>7. Code Structure</w:t>
-      </w:r>
-    </w:p>
-    <w:p>
-      <w:pPr>
-        <w:rPr>
-          <w:lang w:val="en-AU" w:eastAsia="zh-CN"/>
-        </w:rPr>
-      </w:pPr>
-      <w:r>
-        <w:rPr>
-          <w:lang w:val="en-AU" w:eastAsia="zh-CN"/>
-        </w:rPr>
-        <w:t>Software will be modular:</w:t>
       </w:r>
     </w:p>
     <w:p>
@@ -1572,14 +1537,14 @@
           <w:numId w:val="2"/>
         </w:numPr>
         <w:rPr>
-          <w:lang w:val="en-AU" w:eastAsia="zh-CN"/>
-        </w:rPr>
-      </w:pPr>
-      <w:r>
-        <w:rPr>
-          <w:lang w:val="en-AU" w:eastAsia="zh-CN"/>
-        </w:rPr>
-        <w:t>Main controller: orchestrates FSM and sensor reading</w:t>
+          <w:lang w:eastAsia="zh-CN"/>
+        </w:rPr>
+      </w:pPr>
+      <w:r>
+        <w:rPr>
+          <w:lang w:eastAsia="zh-CN"/>
+        </w:rPr>
+        <w:t>Distance sensors: detect walls and obstacles for navigation and collision avoidance.</w:t>
       </w:r>
     </w:p>
     <w:p>
@@ -1589,14 +1554,96 @@
           <w:numId w:val="2"/>
         </w:numPr>
         <w:rPr>
-          <w:lang w:val="en-AU" w:eastAsia="zh-CN"/>
-        </w:rPr>
-      </w:pPr>
-      <w:r>
-        <w:rPr>
-          <w:lang w:val="en-AU" w:eastAsia="zh-CN"/>
-        </w:rPr>
-        <w:t>Movement module: provides forward, turn, and stop commands</w:t>
+          <w:lang w:eastAsia="zh-CN"/>
+        </w:rPr>
+      </w:pPr>
+      <w:r>
+        <w:rPr>
+          <w:lang w:val="en-AU" w:eastAsia="zh-CN"/>
+        </w:rPr>
+        <w:t>Wheel</w:t>
+      </w:r>
+      <w:r>
+        <w:rPr>
+          <w:lang w:eastAsia="zh-CN"/>
+        </w:rPr>
+        <w:t xml:space="preserve"> encoders: track movement distance for navigation accuracy.</w:t>
+      </w:r>
+    </w:p>
+    <w:p>
+      <w:pPr>
+        <w:rPr>
+          <w:lang w:val="en-AU" w:eastAsia="zh-CN"/>
+        </w:rPr>
+      </w:pPr>
+      <w:r>
+        <w:rPr>
+          <w:lang w:val="en-AU" w:eastAsia="zh-CN"/>
+        </w:rPr>
+        <w:t>Sensor fusion and multi-condition logic will allow accurate, reliable decisions, supporting safe maze navigation (Corke, 2011)</w:t>
+      </w:r>
+      <w:r>
+        <w:rPr>
+          <w:lang w:val="en-AU" w:eastAsia="zh-CN"/>
+        </w:rPr>
+        <w:t>.</w:t>
+      </w:r>
+    </w:p>
+    <w:p>
+      <w:pPr>
+        <w:pStyle w:val="Heading1"/>
+        <w:rPr>
+          <w:lang w:val="en-AU"/>
+        </w:rPr>
+      </w:pPr>
+      <w:r>
+        <w:rPr>
+          <w:lang w:val="en-AU"/>
+        </w:rPr>
+        <w:t>6. Safety and Robustness</w:t>
+      </w:r>
+    </w:p>
+    <w:p>
+      <w:pPr>
+        <w:rPr>
+          <w:b/>
+        </w:rPr>
+      </w:pPr>
+      <w:r>
+        <w:t>Emergency stops will prevent collisions. Fail-safe behaviours will allow the robot to respond to blocked paths or unexpected conditions. Timeout mechanisms will prevent the robot from becoming stuck indefinitely</w:t>
+      </w:r>
+      <w:r>
+        <w:rPr>
+          <w:b/>
+        </w:rPr>
+        <w:t>.</w:t>
+      </w:r>
+    </w:p>
+    <w:p>
+      <w:pPr>
+        <w:pStyle w:val="Heading1"/>
+        <w:rPr>
+          <w:lang w:val="en-AU"/>
+        </w:rPr>
+      </w:pPr>
+      <w:r>
+        <w:rPr>
+          <w:lang w:val="en-AU"/>
+        </w:rPr>
+        <w:t>7. Code Structure</w:t>
+      </w:r>
+    </w:p>
+    <w:p>
+      <w:pPr>
+        <w:rPr>
+          <w:lang w:val="en-AU" w:eastAsia="zh-CN"/>
+        </w:rPr>
+      </w:pPr>
+      <w:r>
+        <w:rPr>
+          <w:lang w:val="en-AU" w:eastAsia="zh-CN"/>
+        </w:rPr>
+        <w:t>Software will be modular:</w:t>
       </w:r>
     </w:p>
     <w:p>
@@ -1613,7 +1660,7 @@
         <w:rPr>
           <w:lang w:val="en-AU" w:eastAsia="zh-CN"/>
         </w:rPr>
-        <w:t>Sensor module: reads distance sensors, camera, and wheel encoders</w:t>
+        <w:t>Main controller: orchestrates FSM and sensor reading</w:t>
       </w:r>
     </w:p>
     <w:p>
@@ -1630,7 +1677,94 @@
         <w:rPr>
           <w:lang w:val="en-AU" w:eastAsia="zh-CN"/>
         </w:rPr>
-        <w:t>Decision module: FSM interprets inputs and decides actions</w:t>
+        <w:t>Movement module: provides forward, turn, and stop commands</w:t>
+      </w:r>
+    </w:p>
+    <w:p>
+      <w:pPr>
+        <w:numPr>
+          <w:ilvl w:val="0"/>
+          <w:numId w:val="2"/>
+        </w:numPr>
+        <w:rPr>
+          <w:lang w:val="en-AU" w:eastAsia="zh-CN"/>
+        </w:rPr>
+      </w:pPr>
+      <w:r>
+        <w:rPr>
+          <w:lang w:val="en-AU" w:eastAsia="zh-CN"/>
+        </w:rPr>
+        <w:t>Sensor module: reads distance sensors</w:t>
+      </w:r>
+      <w:r>
+        <w:rPr>
+          <w:lang w:val="en-AU" w:eastAsia="zh-CN"/>
+        </w:rPr>
+        <w:t xml:space="preserve"> </w:t>
+      </w:r>
+      <w:r>
+        <w:rPr>
+          <w:lang w:val="en-AU" w:eastAsia="zh-CN"/>
+        </w:rPr>
+        <w:t>and wheel encoders</w:t>
+      </w:r>
+    </w:p>
+    <w:p>
+      <w:pPr>
+        <w:numPr>
+          <w:ilvl w:val="0"/>
+          <w:numId w:val="2"/>
+        </w:numPr>
+        <w:rPr>
+          <w:lang w:val="en-AU" w:eastAsia="zh-CN"/>
+        </w:rPr>
+      </w:pPr>
+      <w:r>
+        <w:rPr>
+          <w:lang w:val="en-AU" w:eastAsia="zh-CN"/>
+        </w:rPr>
+        <w:t xml:space="preserve">Decision module: </w:t>
+      </w:r>
+      <w:r>
+        <w:rPr>
+          <w:lang w:val="en-AU" w:eastAsia="zh-CN"/>
+        </w:rPr>
+        <w:t xml:space="preserve">the </w:t>
+      </w:r>
+      <w:r>
+        <w:rPr>
+          <w:lang w:val="en-AU" w:eastAsia="zh-CN"/>
+        </w:rPr>
+        <w:t xml:space="preserve">FSM interprets inputs and </w:t>
+      </w:r>
+      <w:r>
+        <w:rPr>
+          <w:lang w:val="en-AU" w:eastAsia="zh-CN"/>
+        </w:rPr>
+        <w:t>determine</w:t>
+      </w:r>
+      <w:r>
+        <w:rPr>
+          <w:lang w:val="en-AU" w:eastAsia="zh-CN"/>
+        </w:rPr>
+        <w:t>s actions</w:t>
+      </w:r>
+    </w:p>
+    <w:p>
+      <w:pPr>
+        <w:numPr>
+          <w:ilvl w:val="0"/>
+          <w:numId w:val="2"/>
+        </w:numPr>
+        <w:rPr>
+          <w:lang w:val="en-AU" w:eastAsia="zh-CN"/>
+        </w:rPr>
+      </w:pPr>
+      <w:r>
+        <w:rPr>
+          <w:lang w:eastAsia="zh-CN"/>
+        </w:rPr>
+        <w:t>Configuration module (config.py): stores system parameters such as sensor thresholds, speed settings, and control constants</w:t>
       </w:r>
     </w:p>
     <w:p>
@@ -1749,11 +1883,14 @@
       </w:pPr>
       <w:r>
         <w:rPr>
-          <w:lang w:val="en-AU" w:eastAsia="zh-CN"/>
-        </w:rPr>
-        <w:t>Potential limitations may include loops in complex mazes or efficiency issues with the wall-following strategy, which may require additional logic in future iterations</w:t>
-      </w:r>
-      <w:r>
+          <w:lang w:eastAsia="zh-CN"/>
+        </w:rPr>
+        <w:t>Potential limitations may include inefficient paths or looping in complex maze configurations, particularly when using wall-following strategies, which may require additional logic in future iterations</w:t>
+      </w:r>
+      <w:r>
+        <w:rPr>
+          <w:lang w:eastAsia="zh-CN"/>
+        </w:rPr>
         <w:t xml:space="preserve"> </w:t>
       </w:r>
       <w:r>
@@ -1768,15 +1905,6 @@
         </w:rPr>
         <w:t>.</w:t>
       </w:r>
-    </w:p>
-    <w:p>
-      <w:pPr>
-        <w:spacing w:after="160" w:line="278" w:lineRule="auto"/>
-        <w:jc w:val="left"/>
-        <w:rPr>
-          <w:lang w:val="en-AU" w:eastAsia="zh-CN"/>
-        </w:rPr>
-      </w:pPr>
       <w:r>
         <w:rPr>
           <w:lang w:val="en-AU" w:eastAsia="zh-CN"/>
@@ -2216,6 +2344,119 @@
     </w:lvl>
   </w:abstractNum>
   <w:abstractNum w:abstractNumId="1" w15:restartNumberingAfterBreak="0">
+    <w:nsid w:val="40A667A6"/>
+    <w:multiLevelType w:val="hybridMultilevel"/>
+    <w:tmpl w:val="0E7E4696"/>
+    <w:lvl w:ilvl="0" w:tplc="0C090001">
+      <w:start w:val="1"/>
+      <w:numFmt w:val="bullet"/>
+      <w:lvlText w:val=""/>
+      <w:lvlJc w:val="left"/>
+      <w:pPr>
+        <w:ind w:left="720" w:hanging="360"/>
+      </w:pPr>
+      <w:rPr>
+        <w:rFonts w:ascii="Symbol" w:hAnsi="Symbol" w:hint="default"/>
+      </w:rPr>
+    </w:lvl>
+    <w:lvl w:ilvl="1" w:tplc="0C090003" w:tentative="1">
+      <w:start w:val="1"/>
+      <w:numFmt w:val="bullet"/>
+      <w:lvlText w:val="o"/>
+      <w:lvlJc w:val="left"/>
+      <w:pPr>
+        <w:ind w:left="1440" w:hanging="360"/>
+      </w:pPr>
+      <w:rPr>
+        <w:rFonts w:ascii="Courier New" w:hAnsi="Courier New" w:cs="Courier New" w:hint="default"/>
+      </w:rPr>
+    </w:lvl>
+    <w:lvl w:ilvl="2" w:tplc="0C090005" w:tentative="1">
+      <w:start w:val="1"/>
+      <w:numFmt w:val="bullet"/>
+      <w:lvlText w:val=""/>
+      <w:lvlJc w:val="left"/>
+      <w:pPr>
+        <w:ind w:left="2160" w:hanging="360"/>
+      </w:pPr>
+      <w:rPr>
+        <w:rFonts w:ascii="Wingdings" w:hAnsi="Wingdings" w:hint="default"/>
+      </w:rPr>
+    </w:lvl>
+    <w:lvl w:ilvl="3" w:tplc="0C090001" w:tentative="1">
+      <w:start w:val="1"/>
+      <w:numFmt w:val="bullet"/>
+      <w:lvlText w:val=""/>
+      <w:lvlJc w:val="left"/>
+      <w:pPr>
+        <w:ind w:left="2880" w:hanging="360"/>
+      </w:pPr>
+      <w:rPr>
+        <w:rFonts w:ascii="Symbol" w:hAnsi="Symbol" w:hint="default"/>
+      </w:rPr>
+    </w:lvl>
+    <w:lvl w:ilvl="4" w:tplc="0C090003" w:tentative="1">
+      <w:start w:val="1"/>
+      <w:numFmt w:val="bullet"/>
+      <w:lvlText w:val="o"/>
+      <w:lvlJc w:val="left"/>
+      <w:pPr>
+        <w:ind w:left="3600" w:hanging="360"/>
+      </w:pPr>
+      <w:rPr>
+        <w:rFonts w:ascii="Courier New" w:hAnsi="Courier New" w:cs="Courier New" w:hint="default"/>
+      </w:rPr>
+    </w:lvl>
+    <w:lvl w:ilvl="5" w:tplc="0C090005" w:tentative="1">
+      <w:start w:val="1"/>
+      <w:numFmt w:val="bullet"/>
+      <w:lvlText w:val=""/>
+      <w:lvlJc w:val="left"/>
+      <w:pPr>
+        <w:ind w:left="4320" w:hanging="360"/>
+      </w:pPr>
+      <w:rPr>
+        <w:rFonts w:ascii="Wingdings" w:hAnsi="Wingdings" w:hint="default"/>
+      </w:rPr>
+    </w:lvl>
+    <w:lvl w:ilvl="6" w:tplc="0C090001" w:tentative="1">
+      <w:start w:val="1"/>
+      <w:numFmt w:val="bullet"/>
+      <w:lvlText w:val=""/>
+      <w:lvlJc w:val="left"/>
+      <w:pPr>
+        <w:ind w:left="5040" w:hanging="360"/>
+      </w:pPr>
+      <w:rPr>
+        <w:rFonts w:ascii="Symbol" w:hAnsi="Symbol" w:hint="default"/>
+      </w:rPr>
+    </w:lvl>
+    <w:lvl w:ilvl="7" w:tplc="0C090003" w:tentative="1">
+      <w:start w:val="1"/>
+      <w:numFmt w:val="bullet"/>
+      <w:lvlText w:val="o"/>
+      <w:lvlJc w:val="left"/>
+      <w:pPr>
+        <w:ind w:left="5760" w:hanging="360"/>
+      </w:pPr>
+      <w:rPr>
+        <w:rFonts w:ascii="Courier New" w:hAnsi="Courier New" w:cs="Courier New" w:hint="default"/>
+      </w:rPr>
+    </w:lvl>
+    <w:lvl w:ilvl="8" w:tplc="0C090005" w:tentative="1">
+      <w:start w:val="1"/>
+      <w:numFmt w:val="bullet"/>
+      <w:lvlText w:val=""/>
+      <w:lvlJc w:val="left"/>
+      <w:pPr>
+        <w:ind w:left="6480" w:hanging="360"/>
+      </w:pPr>
+      <w:rPr>
+        <w:rFonts w:ascii="Wingdings" w:hAnsi="Wingdings" w:hint="default"/>
+      </w:rPr>
+    </w:lvl>
+  </w:abstractNum>
+  <w:abstractNum w:abstractNumId="2" w15:restartNumberingAfterBreak="0">
     <w:nsid w:val="456565C3"/>
     <w:multiLevelType w:val="multilevel"/>
     <w:tmpl w:val="835A93A4"/>
@@ -2364,7 +2605,7 @@
       </w:rPr>
     </w:lvl>
   </w:abstractNum>
-  <w:abstractNum w:abstractNumId="2" w15:restartNumberingAfterBreak="0">
+  <w:abstractNum w:abstractNumId="3" w15:restartNumberingAfterBreak="0">
     <w:nsid w:val="49AC1D2B"/>
     <w:multiLevelType w:val="hybridMultilevel"/>
     <w:tmpl w:val="4E0463E0"/>
@@ -2477,7 +2718,7 @@
       </w:rPr>
     </w:lvl>
   </w:abstractNum>
-  <w:abstractNum w:abstractNumId="3" w15:restartNumberingAfterBreak="0">
+  <w:abstractNum w:abstractNumId="4" w15:restartNumberingAfterBreak="0">
     <w:nsid w:val="4B885250"/>
     <w:multiLevelType w:val="multilevel"/>
     <w:tmpl w:val="014E7862"/>
@@ -2626,7 +2867,7 @@
       </w:rPr>
     </w:lvl>
   </w:abstractNum>
-  <w:abstractNum w:abstractNumId="4" w15:restartNumberingAfterBreak="0">
+  <w:abstractNum w:abstractNumId="5" w15:restartNumberingAfterBreak="0">
     <w:nsid w:val="50B90457"/>
     <w:multiLevelType w:val="multilevel"/>
     <w:tmpl w:val="53487D7E"/>
@@ -2775,7 +3016,7 @@
       </w:rPr>
     </w:lvl>
   </w:abstractNum>
-  <w:abstractNum w:abstractNumId="5" w15:restartNumberingAfterBreak="0">
+  <w:abstractNum w:abstractNumId="6" w15:restartNumberingAfterBreak="0">
     <w:nsid w:val="662C7E4D"/>
     <w:multiLevelType w:val="multilevel"/>
     <w:tmpl w:val="4350C52C"/>
@@ -2924,7 +3165,7 @@
       </w:rPr>
     </w:lvl>
   </w:abstractNum>
-  <w:abstractNum w:abstractNumId="6" w15:restartNumberingAfterBreak="0">
+  <w:abstractNum w:abstractNumId="7" w15:restartNumberingAfterBreak="0">
     <w:nsid w:val="714E1234"/>
     <w:multiLevelType w:val="multilevel"/>
     <w:tmpl w:val="21E6E7C4"/>
@@ -3070,6 +3311,118 @@
       <w:rPr>
         <w:rFonts w:ascii="Wingdings" w:hAnsi="Wingdings" w:hint="default"/>
         <w:sz w:val="20"/>
+      </w:rPr>
+    </w:lvl>
+  </w:abstractNum>
+  <w:abstractNum w:abstractNumId="8" w15:restartNumberingAfterBreak="0">
+    <w:nsid w:val="75191CA4"/>
+    <w:multiLevelType w:val="hybridMultilevel"/>
+    <w:tmpl w:val="CEE0F2C4"/>
+    <w:lvl w:ilvl="0" w:tplc="74E01F66">
+      <w:numFmt w:val="bullet"/>
+      <w:lvlText w:val="•"/>
+      <w:lvlJc w:val="left"/>
+      <w:pPr>
+        <w:ind w:left="720" w:hanging="360"/>
+      </w:pPr>
+      <w:rPr>
+        <w:rFonts w:ascii="Arial" w:eastAsiaTheme="minorHAnsi" w:hAnsi="Arial" w:cs="Arial" w:hint="default"/>
+      </w:rPr>
+    </w:lvl>
+    <w:lvl w:ilvl="1" w:tplc="0C090003" w:tentative="1">
+      <w:start w:val="1"/>
+      <w:numFmt w:val="bullet"/>
+      <w:lvlText w:val="o"/>
+      <w:lvlJc w:val="left"/>
+      <w:pPr>
+        <w:ind w:left="1440" w:hanging="360"/>
+      </w:pPr>
+      <w:rPr>
+        <w:rFonts w:ascii="Courier New" w:hAnsi="Courier New" w:cs="Courier New" w:hint="default"/>
+      </w:rPr>
+    </w:lvl>
+    <w:lvl w:ilvl="2" w:tplc="0C090005" w:tentative="1">
+      <w:start w:val="1"/>
+      <w:numFmt w:val="bullet"/>
+      <w:lvlText w:val=""/>
+      <w:lvlJc w:val="left"/>
+      <w:pPr>
+        <w:ind w:left="2160" w:hanging="360"/>
+      </w:pPr>
+      <w:rPr>
+        <w:rFonts w:ascii="Wingdings" w:hAnsi="Wingdings" w:hint="default"/>
+      </w:rPr>
+    </w:lvl>
+    <w:lvl w:ilvl="3" w:tplc="0C090001" w:tentative="1">
+      <w:start w:val="1"/>
+      <w:numFmt w:val="bullet"/>
+      <w:lvlText w:val=""/>
+      <w:lvlJc w:val="left"/>
+      <w:pPr>
+        <w:ind w:left="2880" w:hanging="360"/>
+      </w:pPr>
+      <w:rPr>
+        <w:rFonts w:ascii="Symbol" w:hAnsi="Symbol" w:hint="default"/>
+      </w:rPr>
+    </w:lvl>
+    <w:lvl w:ilvl="4" w:tplc="0C090003" w:tentative="1">
+      <w:start w:val="1"/>
+      <w:numFmt w:val="bullet"/>
+      <w:lvlText w:val="o"/>
+      <w:lvlJc w:val="left"/>
+      <w:pPr>
+        <w:ind w:left="3600" w:hanging="360"/>
+      </w:pPr>
+      <w:rPr>
+        <w:rFonts w:ascii="Courier New" w:hAnsi="Courier New" w:cs="Courier New" w:hint="default"/>
+      </w:rPr>
+    </w:lvl>
+    <w:lvl w:ilvl="5" w:tplc="0C090005" w:tentative="1">
+      <w:start w:val="1"/>
+      <w:numFmt w:val="bullet"/>
+      <w:lvlText w:val=""/>
+      <w:lvlJc w:val="left"/>
+      <w:pPr>
+        <w:ind w:left="4320" w:hanging="360"/>
+      </w:pPr>
+      <w:rPr>
+        <w:rFonts w:ascii="Wingdings" w:hAnsi="Wingdings" w:hint="default"/>
+      </w:rPr>
+    </w:lvl>
+    <w:lvl w:ilvl="6" w:tplc="0C090001" w:tentative="1">
+      <w:start w:val="1"/>
+      <w:numFmt w:val="bullet"/>
+      <w:lvlText w:val=""/>
+      <w:lvlJc w:val="left"/>
+      <w:pPr>
+        <w:ind w:left="5040" w:hanging="360"/>
+      </w:pPr>
+      <w:rPr>
+        <w:rFonts w:ascii="Symbol" w:hAnsi="Symbol" w:hint="default"/>
+      </w:rPr>
+    </w:lvl>
+    <w:lvl w:ilvl="7" w:tplc="0C090003" w:tentative="1">
+      <w:start w:val="1"/>
+      <w:numFmt w:val="bullet"/>
+      <w:lvlText w:val="o"/>
+      <w:lvlJc w:val="left"/>
+      <w:pPr>
+        <w:ind w:left="5760" w:hanging="360"/>
+      </w:pPr>
+      <w:rPr>
+        <w:rFonts w:ascii="Courier New" w:hAnsi="Courier New" w:cs="Courier New" w:hint="default"/>
+      </w:rPr>
+    </w:lvl>
+    <w:lvl w:ilvl="8" w:tplc="0C090005" w:tentative="1">
+      <w:start w:val="1"/>
+      <w:numFmt w:val="bullet"/>
+      <w:lvlText w:val=""/>
+      <w:lvlJc w:val="left"/>
+      <w:pPr>
+        <w:ind w:left="6480" w:hanging="360"/>
+      </w:pPr>
+      <w:rPr>
+        <w:rFonts w:ascii="Wingdings" w:hAnsi="Wingdings" w:hint="default"/>
       </w:rPr>
     </w:lvl>
   </w:abstractNum>
@@ -3077,22 +3430,28 @@
     <w:abstractNumId w:val="0"/>
   </w:num>
   <w:num w:numId="2" w16cid:durableId="1997487202">
+    <w:abstractNumId w:val="4"/>
+  </w:num>
+  <w:num w:numId="3" w16cid:durableId="1205370311">
+    <w:abstractNumId w:val="2"/>
+  </w:num>
+  <w:num w:numId="4" w16cid:durableId="1753769699">
+    <w:abstractNumId w:val="5"/>
+  </w:num>
+  <w:num w:numId="5" w16cid:durableId="1106388352">
     <w:abstractNumId w:val="3"/>
   </w:num>
-  <w:num w:numId="3" w16cid:durableId="1205370311">
+  <w:num w:numId="6" w16cid:durableId="1933515475">
+    <w:abstractNumId w:val="6"/>
+  </w:num>
+  <w:num w:numId="7" w16cid:durableId="2091541781">
+    <w:abstractNumId w:val="7"/>
+  </w:num>
+  <w:num w:numId="8" w16cid:durableId="1195270151">
     <w:abstractNumId w:val="1"/>
   </w:num>
-  <w:num w:numId="4" w16cid:durableId="1753769699">
-    <w:abstractNumId w:val="4"/>
-  </w:num>
-  <w:num w:numId="5" w16cid:durableId="1106388352">
-    <w:abstractNumId w:val="2"/>
-  </w:num>
-  <w:num w:numId="6" w16cid:durableId="1933515475">
-    <w:abstractNumId w:val="5"/>
-  </w:num>
-  <w:num w:numId="7" w16cid:durableId="2091541781">
-    <w:abstractNumId w:val="6"/>
+  <w:num w:numId="9" w16cid:durableId="1563062497">
+    <w:abstractNumId w:val="8"/>
   </w:num>
   <w:numIdMacAtCleanup w:val="7"/>
 </w:numbering>
@@ -3721,7 +4080,6 @@
   <w:style w:type="character" w:default="1" w:styleId="DefaultParagraphFont">
     <w:name w:val="Default Paragraph Font"/>
     <w:uiPriority w:val="1"/>
-    <w:semiHidden/>
     <w:unhideWhenUsed/>
   </w:style>
   <w:style w:type="table" w:default="1" w:styleId="TableNormal">

</xml_diff>